<commit_message>
revision3: response letter v5, figure set, caption alignment
- Response_to_Reviewers_v5.txt/.docx (+ generator, same layout as v4):
  operating-point redefinition (0.50 primary, similarity exploratory),
  test-only reporting, McNemar agreement test, equivalence intervals,
  abstract number reduction, figure changes; answers A5/A7/A8/M1 rewritten
- figures/: delivery set of 7 figures; Fig 2-A regenerated at 0.50
  (134/0/6/128) by make_confusion_matrix_a.py; validation ROC panel excluded
- captions: Fig 2 panel-wise operating points, Fig 3 test-only + DeLong note,
  Fig 4/5 aligned to the actual density + paired-shift panels
- figure_plan.md: what was done, what was left out

Discord: https://discord.com/channels/1558830378104529049/1563001479311138826
</commit_message>
<xml_diff>
--- a/paper_submission/revision3/tables_v3.docx
+++ b/paper_submission/revision3/tables_v3.docx
@@ -5047,7 +5047,7 @@
           <w:color w:val="DC1414"/>
           <w:sz w:val="19"/>
         </w:rPr>
-        <w:t>Panels (A)-(C) show the test-set confusion matrices. At the exploratory similarity operating points (Table 3B), all three outputs yield the same single false positive; at the primary operating point (confidence score &gt;= 0.50) the errors are false negatives instead (Table 3). The failure modes therefore differ by operating point.</w:t>
+        <w:t>Test set only. (A) Confidence score at the prespecified 0.50 operating point: 134 TP, 0 FP, 6 FN, 128 TN. (B) HCC cosine score and (C) Δscore at their validation Youden operating points (exploratory): 140 TP, 1 FP, 0 FN, 127 TN. The single false positive is the sample that is classified correctly at 0.50, so the failure modes differ by operating point (Table 3, Table 3B).</w:t>
       </w:r>
     </w:p>
     <w:p>
@@ -5058,6 +5058,7 @@
         <w:rPr>
           <w:rFonts w:ascii="Malgun Gothic" w:hAnsi="Malgun Gothic"/>
           <w:b/>
+          <w:color w:val="DC1414"/>
           <w:sz w:val="20"/>
         </w:rPr>
         <w:t>Figure 3. Triple Receiver Operating Characteristic (ROC) Curves on Test Set.</w:t>
@@ -5066,9 +5067,10 @@
       <w:r>
         <w:rPr>
           <w:rFonts w:ascii="Malgun Gothic" w:hAnsi="Malgun Gothic"/>
+          <w:color w:val="DC1414"/>
           <w:sz w:val="19"/>
         </w:rPr>
-        <w:t>ROC curves for ROC-A (Confidence Score), ROC-B (HCC Cosine Score), and ROC-C (Δscore). All three metrics achieve an AUROC of 1.000 on the held-out test set under the clean subset benchmark.</w:t>
+        <w:t>Test set only. ROC curves for ROC-A (confidence score), ROC-B (HCC cosine score) and ROC-C (Δscore). All three reach AUROC 1.000 and the curves overlap, so DeLong testing carries no information; no superiority or non-inferiority is claimed. The validation panel is not shown (test-only reporting).</w:t>
       </w:r>
     </w:p>
     <w:p>

</xml_diff>

<commit_message>
deck(v4): show each score's cutoff and its zero-error interval on slide 7
- slide 7 right column: ROC + table of confidence 0.50 / HCC cosine -0.0048 /
  Delta score -0.9585 with the test zero-error interval for each
- note states the 0.50 value lies inside its interval and the two
  validation-Youden values fall outside
- wording aligned: "equivalence interval" now defined as the test threshold
  range that keeps errors at zero (Table 3B header, footnotes, methods, README)
- Table 3 footnote adds the confidence interval (0.4038, 0.5444]
- script section 7 points at the second table
- rebuilt HTML/PDF and docs/talk page

Discord: https://discord.com/channels/1558830378104529049/1563001479311138826
</commit_message>
<xml_diff>
--- a/paper_submission/revision3/tables_v3.docx
+++ b/paper_submission/revision3/tables_v3.docx
@@ -2820,7 +2820,7 @@
           <w:color w:val="DC1414"/>
           <w:sz w:val="17"/>
         </w:rPr>
-        <w:t>Performance is reported for the test set only; validation-set performance is not reported because thresholds were derived there (in-sample). The primary operating point was prespecified at a confidence score of 0.50 rather than a validation-derived Youden point, because AUROC reached the ceiling (1.000) in the derivation cohort. Test set: n=268 (HCC 140, hemangioma 128). Misclassifications at this operating point were false negatives only. 95% confidence intervals are Wilson score intervals estimated at the image level.</w:t>
+        <w:t>Performance is reported for the test set only; validation-set performance is not reported because thresholds were derived there (in-sample). The primary operating point was prespecified at a confidence score of 0.50 rather than a validation-derived Youden point, because AUROC reached the ceiling (1.000) in the derivation cohort. Test set: n=268 (HCC 140, hemangioma 128). Misclassifications at this operating point were false negatives only. The 0.50 cutoff lies inside the test zero-error interval (0.4038, 0.5444]. 95% confidence intervals are Wilson score intervals estimated at the image level.</w:t>
       </w:r>
     </w:p>
     <w:p>
@@ -2905,7 +2905,7 @@
                 <w:b/>
                 <w:sz w:val="19"/>
               </w:rPr>
-              <w:t>Test equivalence interval</w:t>
+              <w:t>Test zero-error interval</w:t>
             </w:r>
           </w:p>
         </w:tc>
@@ -3187,7 +3187,7 @@
           <w:color w:val="DC1414"/>
           <w:sz w:val="17"/>
         </w:rPr>
-        <w:t>Cutoffs were derived on the validation set (Youden's J) but all performance, confusion matrices and equivalence intervals are reported for the test set only. Equivalence interval = the range of test-set thresholds yielding identical classification performance; because AUROC reached 1.000 in the derivation cohort, the optimum is not unique. Both similarity outputs produced the same single false positive, which is classified correctly at the primary 0.50 operating point. Discordant classifications versus the primary operating point: 6 versus 1 (McNemar exact p = 0.125); neither superiority nor non-inferiority is claimed. Thresholds require re-derivation in an external cohort.</w:t>
+        <w:t>Cutoffs were derived on the validation set (Youden's J) but all performance, confusion matrices and equivalence intervals are reported for the test set only. Zero-error interval = the range of test-set thresholds that keeps test errors at zero; because AUROC reached 1.000 in the derivation cohort, the optimum is not unique. Both similarity outputs produced the same single false positive, which is classified correctly at the primary 0.50 operating point. Discordant classifications versus the primary operating point: 6 versus 1 (McNemar exact p = 0.125); neither superiority nor non-inferiority is claimed. Thresholds require re-derivation in an external cohort.</w:t>
       </w:r>
     </w:p>
     <w:p>

</xml_diff>